<commit_message>
Revise article: fix parallel structures, author names, journal refs
- Rewrite tasks/novelty/criteria sections to eliminate formulaic
  parallel structure (Первый/Второй/В нормативном плане etc.)
- Rename Section 3.3 to reflect motivational focus of content
- Fix Li et al. [30] interpretation re chatbot lexical limitation
- Rewrite Sections 4.1, 4.3, 5 as analytical flowing prose
- Fix 6 incorrect first-author names ([36]→Fan, [37]→Ge, [38]→Ma,
  [40]→Pan, [42]→Almegren, [43]→Zaimoğlu) in refs and body text
- Add journal names/DOIs to 11 refs missing them ([16],[17],[35]-[38],
  [40]-[43],[45]); add URL to ref [7] (Godwin-Jones 2023 LLT)
- Hedge absolute claims ("насколько нам известно", "не обнаружено")

Co-Authored-By: Claude Sonnet 4.6 <noreply@anthropic.com>
Claude-Session: https://claude.ai/code/session_01DdwFmc9CMSgbQTYTGNDF9m
</commit_message>
<xml_diff>
--- a/статья_ИИ_в_преподавании_английского.docx
+++ b/статья_ИИ_в_преподавании_английского.docx
@@ -151,7 +151,7 @@
           <w:rFonts w:ascii="Times New Roman" w:hAnsi="Times New Roman" w:cs="Times New Roman"/>
           <w:sz w:val="24"/>
         </w:rPr>
-        <w:t>В статье представлен систематический обзор зарубежных исследований 2020–2025 годов по интеграции технологий искусственного интеллекта (ИИ) в методику преподавания английского языка в высшей школе. Анализ 50 источников открытого доступа, охватывавших базы данных PubMed Central, MDPI, Language Learning and Technology, TESL-EJ, Frontiers, ERIC, IRRODL и arXiv, проводился по пяти тематическим блокам. Среди них ИИ в развитии письменной речи, применение ИИ-чатботов в устноречевой практике, адаптивное обучение и персонализация образовательных траекторий, трансформация профессиональной роли преподавателя, этические риски и педагогические ограничения. Установлено, что дидактический потенциал ИИ-инструментов реализуется лишь при их методически обоснованной интеграции. Ни одно из рассмотренных исследований не подтверждает возможности или целесообразности замены преподавателя. Для российского педагогического вуза выделены три направления с наибольшим потенциалом адаптации, а именно ИИ-поддержка письменной речи, расширение внеаудиторной устноречевой практики и подготовка будущих учителей к работе в ИИ-насыщенной образовательной среде. Определены педагогические условия успешной адаптации и ограничения переносимости зарубежного опыта. Результаты могут применяться при проектировании учебных программ, разработке методических рекомендаций и программ повышения квалификации преподавателей английского языка педагогических вузов.</w:t>
+        <w:t>В статье представлен систематический обзор зарубежных исследований 2020–2025 годов по интеграции технологий искусственного интеллекта (ИИ) в методику преподавания английского языка в высшей школе. Анализ 50 источников открытого доступа, охватывавших базы данных PubMed Central, MDPI, Language Learning and Technology, TESL-EJ, Frontiers, ERIC, IRRODL и arXiv, проводился по пяти тематическим блокам. Среди них ИИ в развитии письменной речи, применение ИИ-чатботов в устноречевой практике, адаптивное обучение и мотивационные эффекты, трансформация профессиональной роли преподавателя, этические риски и педагогические ограничения. Установлено, что дидактический потенциал ИИ-инструментов реализуется лишь при их методически обоснованной интеграции. Среди рассмотренных исследований не обнаружено ни одной работы, подтверждающей возможность или целесообразность замены преподавателя. Для российского педагогического вуза выделены три направления с наибольшим потенциалом адаптации, а именно ИИ-поддержка письменной речи, расширение внеаудиторной устноречевой практики и подготовка будущих учителей к работе в ИИ-насыщенной образовательной среде. Определены педагогические условия успешной адаптации и ограничения переносимости зарубежного опыта. Результаты могут применяться при проектировании учебных программ, разработке методических рекомендаций и программ повышения квалификации преподавателей английского языка педагогических вузов.</w:t>
       </w:r>
     </w:p>
     <w:p>
@@ -207,7 +207,7 @@
           <w:rFonts w:ascii="Times New Roman" w:hAnsi="Times New Roman" w:cs="Times New Roman"/>
           <w:sz w:val="24"/>
         </w:rPr>
-        <w:t>The article presents a systematic review of foreign research (2020–2025) on the integration of artificial intelligence (AI) technologies into English language teaching methodology in higher education. Fifty open-access sources drawn from PubMed Central, MDPI, Language Learning and Technology, TESL-EJ, Frontiers, ERIC, IRRODL, and arXiv were analyzed across five thematic directions, namely AI in writing development, AI chatbots and oral speech practice, adaptive learning and personalization of educational trajectories, transformation of the teacher's professional role, and ethical risks and pedagogical limitations. The review establishes that the didactic potential of AI tools is realized only when their integration is methodologically grounded; none of the reviewed studies confirms either the feasibility or desirability of replacing the teacher. Three directions are identified as having the highest adaptation potential for Russian pedagogical universities, namely AI-supported writing instruction, expansion of out-of-class oral practice, and preparing future teachers to work in AI-saturated educational environments. Pedagogical conditions for successful adaptation and limitations on the transferability of foreign experience are identified. The findings may inform curriculum design, methodological guidelines, and professional development programs for English language teachers at pedagogical universities.</w:t>
+        <w:t>The article presents a systematic review of foreign research (2020–2025) on the integration of artificial intelligence (AI) technologies into English language teaching methodology in higher education. Fifty open-access sources drawn from PubMed Central, MDPI, Language Learning and Technology, TESL-EJ, Frontiers, ERIC, IRRODL, and arXiv were analyzed across five thematic directions, namely AI in writing development, AI chatbots and oral speech practice, adaptive learning and motivational effects, transformation of the teacher's professional role, and ethical risks and pedagogical limitations. The review establishes that the didactic potential of AI tools is realized only when their integration is methodologically grounded; no reviewed study was found confirming either the feasibility or desirability of replacing the teacher. Three directions are identified as having the highest adaptation potential for Russian pedagogical universities, namely AI-supported writing instruction, expansion of out-of-class oral practice, and preparing future teachers to work in AI-saturated educational environments. Pedagogical conditions for successful adaptation and limitations on the transferability of foreign experience are identified. The findings may inform curriculum design, methodological guidelines, and professional development programs for English language teachers at pedagogical universities.</w:t>
       </w:r>
     </w:p>
     <w:p>
@@ -291,7 +291,7 @@
           <w:rFonts w:ascii="Times New Roman" w:hAnsi="Times New Roman" w:cs="Times New Roman"/>
           <w:sz w:val="24"/>
         </w:rPr>
-        <w:t>Российская система педагогического образования сталкивается с этой ситуацией в специфических условиях. ФГОС ВО нового поколения закрепляет требование формирования цифровых компетенций, однако конкретных указаний на ИИ-инструменты не содержит, что порождает значительную неопределённость на уровне кафедр и учебных программ. При этом отечественных систематических обзоров, специально посвящённых зарубежному опыту интеграции ИИ именно в методику преподавания английского языка применительно к педагогическому вузу, до настоящего времени не появлялось. Это «белое пятно» и определяет актуальность настоящей работы.</w:t>
+        <w:t>Российская система педагогического образования сталкивается с этой ситуацией в специфических условиях. ФГОС ВО нового поколения закрепляет требование формирования цифровых компетенций, однако конкретных указаний на ИИ-инструменты не содержит, что порождает значительную неопределённость на уровне кафедр и учебных программ. При этом отечественных систематических обзоров, специально посвящённых зарубежному опыту интеграции ИИ именно в методику преподавания английского языка применительно к педагогическому вузу, насколько нам известно, до настоящего времени не появлялось. Это «белое пятно» и определяет актуальность настоящей работы.</w:t>
       </w:r>
     </w:p>
     <w:p>
@@ -333,7 +333,7 @@
           <w:rFonts w:ascii="Times New Roman" w:hAnsi="Times New Roman" w:cs="Times New Roman"/>
           <w:sz w:val="24"/>
         </w:rPr>
-        <w:t>Задачи исследования охватывают четыре аспекта. Первый предполагает систематизацию основных направлений применения ИИ в обучении английскому языку по данным зарубежных исследований 2020–2025 годов. Второй связан с анализом педагогических эффектов, условий и ограничений применения ИИ-инструментов. Третий касается характеристики трансформации роли преподавателя в ИИ-насыщенной образовательной среде. Четвёртый направлен на определение педагогических условий и барьеров адаптации зарубежного опыта в отечественном педагогическом образовании.</w:t>
+        <w:t>Задачи исследования выстраиваются в аналитическую цепочку, в которой каждое звено создаёт основу для последующего. Исходным шагом служит систематизация основных направлений применения ИИ в обучении английскому языку по материалам зарубежных публикаций 2020–2025 годов, поскольку именно эта картина позволяет судить о реальном масштабе и тематическом составе изучаемой предметной области. На этой основе становится возможным развёрнутый анализ педагогических эффектов, условий и ограничений зафиксированных практик, без которого любые прикладные рекомендации рискуют остаться поверхностными. Существенной частью этого анализа является характеристика трансформации роли преподавателя в ИИ-насыщенной образовательной среде, поскольку именно преподаватель остаётся центральным агентом любой педагогической адаптации. Всё это в совокупности создаёт аналитическую основу для финальной задачи, а именно определения педагогических условий и барьеров переноса зарубежного опыта в контекст российского педагогического вуза.</w:t>
       </w:r>
     </w:p>
     <w:p>
@@ -361,7 +361,7 @@
           <w:rFonts w:ascii="Times New Roman" w:hAnsi="Times New Roman" w:cs="Times New Roman"/>
           <w:sz w:val="24"/>
         </w:rPr>
-        <w:t xml:space="preserve"> работы определяется тем, что данное исследование впервые систематизирует зарубежный опыт интеграции ИИ в методику преподавания английского языка именно с позиций применимости в условиях российского педагогического вуза. В отличие от более широких обзоров по ИИ в языковом образовании [1, 2], здесь предметом специального анализа становятся нормативный, дидактический и институциональный контексты, определяющие как возможности, так и пределы переносимости зарубежного опыта.</w:t>
+        <w:t xml:space="preserve"> работы определяется тем, что исследование ставит перед собой двойную аналитическую задачу. Если обзоры общего плана [1, 2] рассматривают ИИ в языковом образовании применительно к широкому кругу контекстов, то здесь интерес сосредоточен на условиях переносимости зарубежного опыта в конкретный российский педагогический контекст. Это означает, что предметом специального анализа становятся не только педагогические эффекты и дидактические условия применения ИИ-инструментов, но и нормативный, институциональный и технологический контексты, которые в совокупности определяют, какой именно зарубежный опыт окажется переносимым и при каких условиях.</w:t>
       </w:r>
     </w:p>
     <w:p>
@@ -431,7 +431,7 @@
           <w:rFonts w:ascii="Times New Roman" w:hAnsi="Times New Roman" w:cs="Times New Roman"/>
           <w:sz w:val="24"/>
         </w:rPr>
-        <w:t>Включённые в обзор источники удовлетворяли пяти условиям. По периоду публикации в выборку входили работы 2020–2025 годов как наиболее релевантные для изучения современного состояния проблемы. По типу публикации учитывались рецензируемые научные статьи, систематические обзоры и метаанализы. По тематической направленности отбирались источники, посвящённые применению ИИ в обучении английскому языку как иностранному или второму (EFL/ESL) в контексте высшего образования. Обязательным условием служило наличие открытого доступа к полному тексту. Языком публикации выступал английский.</w:t>
+        <w:t>Выбор критериев включения и исключения определялся логикой исследовательского вопроса и необходимостью обеспечить сопоставимость анализируемых данных.</w:t>
       </w:r>
     </w:p>
     <w:p>
@@ -445,7 +445,21 @@
           <w:rFonts w:ascii="Times New Roman" w:hAnsi="Times New Roman" w:cs="Times New Roman"/>
           <w:sz w:val="24"/>
         </w:rPr>
-        <w:t>Из рассмотрения исключались материалы без научного рецензирования, в частности блоги и нерецензируемые конференционные тезисы. Не рассматривались исследования, ориентированные исключительно на школьный уровень (K-12), а также технические публикации об алгоритмах ИИ без педагогической составляющей. Источники, недоступные в открытом доступе, также не принимались.</w:t>
+        <w:t>Хронологические рамки 2020–2025 годов обусловлены тем, что именно в этот период генеративный ИИ перешёл из статуса экспериментального инструмента в категорию массово доступных образовательных технологий, а значит, более ранние исследования описывали принципиально иной технологический ландшафт. В выборку включались рецензируемые научные статьи, систематические обзоры и метаанализы как жанры, гарантирующие минимальный стандарт научной верификации результатов. Тематическим фокусом служило применение ИИ в обучении английскому языку как иностранному или второму (EFL/ESL) в контексте высшего образования, поскольку данные из принципиально иных контекстов, в частности школьного или корпоративного, требуют самостоятельного обоснования переносимости. Обязательным условием являлось наличие открытого доступа к полному тексту, что обеспечивало верифицируемость всех включённых источников. Публикации рассматривались на английском языке как доминирующем в международном педагогическом дискурсе.</w:t>
+      </w:r>
+    </w:p>
+    <w:p>
+      <w:pPr>
+        <w:spacing w:before="0" w:after="120"/>
+        <w:ind w:firstLine="709"/>
+        <w:jc w:val="both"/>
+      </w:pPr>
+      <w:r>
+        <w:rPr>
+          <w:rFonts w:ascii="Times New Roman" w:hAnsi="Times New Roman" w:cs="Times New Roman"/>
+          <w:sz w:val="24"/>
+        </w:rPr>
+        <w:t>Критерии исключения зеркально соответствовали перечисленным условиям. Нерецензируемые материалы, в частности блоги и конференционные тезисы, не обеспечивают необходимого уровня научной верификации. Исследования, ориентированные исключительно на школьный уровень (K-12), исключались ввиду принципиальных методических различий между языковым обучением в школе и вузе. Технические публикации об алгоритмах ИИ без педагогической составляющей находились за пределами предметного поля обзора. Источники, недоступные в открытом доступе, также не принимались.</w:t>
       </w:r>
     </w:p>
     <w:p>
@@ -658,7 +672,7 @@
                 <w:rFonts w:ascii="Times New Roman" w:hAnsi="Times New Roman" w:cs="Times New Roman"/>
                 <w:sz w:val="22"/>
               </w:rPr>
-              <w:t>Адаптивное обучение и персонализация</w:t>
+              <w:t>Мотивационные и адаптивные эффекты ИИ</w:t>
             </w:r>
           </w:p>
         </w:tc>
@@ -932,7 +946,7 @@
           <w:rFonts w:ascii="Times New Roman" w:hAnsi="Times New Roman" w:cs="Times New Roman"/>
           <w:sz w:val="24"/>
         </w:rPr>
-        <w:t>Li et al. [30] сопоставили результаты подготовки с ИИ-чатботом и с преподавателем-фасилитатором. Студенты из обеих групп показали сопоставимые результаты в тестах, однако речь «чатботной» группы отличалась более бедным лексическим репертуаром. Авторы делают вывод о взаимодополнительности двух форматов, а не конкуренции между ними, что представляется более корректной интерпретацией. Смежные данные получены в исследованиях ИИ-опосредованного развития словарного запаса [33] и адаптивного чтения с биометрической обратной связью [32], что свидетельствует о постепенном расширении области применения ИИ-инструментов за пределы традиционной устноречевой практики.</w:t>
+        <w:t>Li et al. [30] сопоставили результаты подготовки с ИИ-чатботом и с преподавателем-фасилитатором. Студенты из обеих групп показали сопоставимые результаты в тестах, однако речь «чатботной» группы отличалась более бедным лексическим репертуаром. Примечательно, что именно это ограничение ИИ-чатбота становится у авторов ключевым аргументом в пользу комбинированного формата, при котором чатбот берёт на себя обеспечение объёма и доступности практики, тогда как преподаватель отвечает за лексическое и дискурсивное обогащение. Смежные данные получены в исследованиях ИИ-опосредованного развития словарного запаса [33] и адаптивного чтения с биометрической обратной связью [32], что свидетельствует о постепенном расширении области применения ИИ-инструментов за пределы традиционной устноречевой практики.</w:t>
       </w:r>
     </w:p>
     <w:p>
@@ -960,7 +974,7 @@
           <w:b/>
           <w:sz w:val="24"/>
         </w:rPr>
-        <w:t>3.3. Адаптивное обучение и персонализация образовательных траекторий</w:t>
+        <w:t>3.3. Мотивационные и адаптивные эффекты ИИ в изучении иностранного языка</w:t>
       </w:r>
     </w:p>
     <w:p>
@@ -974,7 +988,7 @@
           <w:rFonts w:ascii="Times New Roman" w:hAnsi="Times New Roman" w:cs="Times New Roman"/>
           <w:sz w:val="24"/>
         </w:rPr>
-        <w:t>Адаптивные обучающие системы представляют собой наиболее технологически зрелую область применения ИИ в образовании. Применительно к иностранному языку их потенциал очевиден. Уровни владения языком и индивидуальные пробелы у студентов одной группы могут различаться разительно, и единый темп обучения неизбежно оказывается либо избыточным для одних, либо недостаточным для других.</w:t>
+        <w:t>Мотивационное и аффективное измерения оказались одними из наиболее активно исследуемых в контексте ИИ в иноязычном образовании, и это закономерно. Влияние технологии на учебную деятельность реализуется не только через непосредственный прирост знаний и умений, но и через изменение учебной мотивации, установок, готовности к самостоятельному труду и долгосрочного отношения студентов к собственному языковому развитию.</w:t>
       </w:r>
     </w:p>
     <w:p>
@@ -1016,7 +1030,7 @@
           <w:rFonts w:ascii="Times New Roman" w:hAnsi="Times New Roman" w:cs="Times New Roman"/>
           <w:sz w:val="24"/>
         </w:rPr>
-        <w:t>Теоретически важное разграничение предлагают Liu et al. [38], работающие в рамках теории самодетерминации. ИИ-поддержка усиливает автономию студента только при наличии педагогических «строительных лесов» (scaffolding) со стороны преподавателя. В противном случае та же ИИ-поддержка может автономию подавлять, формируя зависимость вместо самостоятельности. Это, на наш взгляд, принципиальный вывод для практики.</w:t>
+        <w:t>Теоретически важное разграничение предлагают Ma et al. [38], работающие в рамках теории самодетерминации. ИИ-поддержка усиливает автономию студента только при наличии педагогических «строительных лесов» (scaffolding) со стороны преподавателя. В противном случае та же ИИ-поддержка может автономию подавлять, формируя зависимость вместо самостоятельности. Это, на наш взгляд, принципиальный вывод для практики.</w:t>
       </w:r>
     </w:p>
     <w:p>
@@ -1030,7 +1044,7 @@
           <w:rFonts w:ascii="Times New Roman" w:hAnsi="Times New Roman" w:cs="Times New Roman"/>
           <w:sz w:val="24"/>
         </w:rPr>
-        <w:t>Wei et al. [36] на основе модели последовательной медиации показали, что путь от ИИ-грамотности студента к устойчивому использованию ИИ в обучении опосредован позитивными установками и удовольствием от взаимодействия с инструментом. Практический вывод прост, хотя и нетривиален. Простого внедрения ИИ-инструментов недостаточно. Необходимо целенаправленное формирование позитивного и одновременно критического отношения к ним.</w:t>
+        <w:t>Fan et al. [36] на основе модели последовательной медиации показали, что путь от ИИ-грамотности студента к устойчивому использованию ИИ в обучении опосредован позитивными установками и удовольствием от взаимодействия с инструментом. Практический вывод прост, хотя и нетривиален. Простого внедрения ИИ-инструментов недостаточно. Необходимо целенаправленное формирование позитивного и одновременно критического отношения к ним.</w:t>
       </w:r>
     </w:p>
     <w:p>
@@ -1044,7 +1058,7 @@
           <w:rFonts w:ascii="Times New Roman" w:hAnsi="Times New Roman" w:cs="Times New Roman"/>
           <w:sz w:val="24"/>
         </w:rPr>
-        <w:t>Смежный результат получен Huang et al. [39] в исследовании L2-установки на рост (L2 growth mindset) в контексте ИИ-чатботов. Воспринимаемая удобность использования чатбота напрямую формировала у студентов установку на рост, которая, в свою очередь, стимулировала долгосрочную речевую вовлечённость. Иными словами, то, насколько органично ИИ-инструмент встроен в учебный процесс, влияет не только на немедленную результативность, но и на устойчивые установки студентов относительно собственного языкового развития. Перспективную теоретическую рамку для интерпретации описанных эффектов предлагают Chen et al. [37], рассматривающие взаимодействие студента с ИИ через призму «экологического сопряжения» (ecological coupling) и показывающие, что это взаимодействие встроено в более широкую учебную экологию, формирующую его исходы. Li et al. [45] эмпирически подтверждают эффективность ИИ-опосредованного скаффолдинга для академических достижений студентов в условиях высшей школы.</w:t>
+        <w:t>Смежный результат получен Huang et al. [39] в исследовании L2-установки на рост (L2 growth mindset) в контексте ИИ-чатботов. Воспринимаемая удобность использования чатбота напрямую формировала у студентов установку на рост, которая, в свою очередь, стимулировала долгосрочную речевую вовлечённость. Иными словами, то, насколько органично ИИ-инструмент встроен в учебный процесс, влияет не только на немедленную результативность, но и на устойчивые установки студентов относительно собственного языкового развития. Перспективную теоретическую рамку для интерпретации описанных эффектов предлагают Ge et al. [37], рассматривающие взаимодействие студента с ИИ через призму «экологического сопряжения» (ecological coupling) и показывающие, что это взаимодействие встроено в более широкую учебную экологию, формирующую его исходы. Li et al. [45] эмпирически подтверждают эффективность ИИ-опосредованного скаффолдинга для академических достижений студентов в условиях высшей школы.</w:t>
       </w:r>
     </w:p>
     <w:p>
@@ -1086,7 +1100,7 @@
           <w:rFonts w:ascii="Times New Roman" w:hAnsi="Times New Roman" w:cs="Times New Roman"/>
           <w:sz w:val="24"/>
         </w:rPr>
-        <w:t>Zhao et al. [42] выделили четыре трансформированные роли, которые приобретает преподаватель английского языка в ИИ-насыщенной среде. Первая из них представляет собой роль эволюционирующего фасилитатора, задачей которого становится организация учебного опыта, а не передача информации. Вторая соответствует специалисту по смешанному обучению, осознанно интегрирующему ИИ в дидактическую систему. Третья связана с позицией гибкого дизайнера учебных материалов, использующего ИИ для быстрой адаптации контента. Четвёртая роль предполагает владение навыками промпт-инжиниринга для получения педагогически ценных результатов от ИИ-систем. Важно, что ни одна из этих ролей не предполагает снижения профессиональной нагрузки, напротив, все они требуют более глубокой педагогической рефлексии.</w:t>
+        <w:t>Almegren et al. [42] выделили четыре трансформированные роли преподавателя английского языка в ИИ-насыщенной среде, которые в совокупности указывают на усложнение, а не упрощение педагогического труда. Согласно авторам, преподаватель приобретает функции фасилитатора учебного опыта, ориентированного на организацию взаимодействия вместо трансляции знания; специалиста по смешанному обучению, осознанно соединяющего ИИ-компоненты с живой дидактикой; гибкого дизайнера учебных материалов, способного оперативно адаптировать контент с помощью ИИ; а также владельца навыков промпт-инжиниринга, позволяющих извлекать педагогически ценные результаты из языковых моделей. Ни одна из этих ролей не предполагает снижения профессиональной нагрузки, все они требуют более глубокой методической рефлексии.</w:t>
       </w:r>
     </w:p>
     <w:p>
@@ -1100,7 +1114,7 @@
           <w:rFonts w:ascii="Times New Roman" w:hAnsi="Times New Roman" w:cs="Times New Roman"/>
           <w:sz w:val="24"/>
         </w:rPr>
-        <w:t>Качественное исследование Sun et al. [43] зафиксировало значительную вариативность в реальных практиках преподавателей. Педагоги с развитыми рефлексивными практиками применяли ИИ для создания дифференцированных заданий. Педагоги с меньшим опытом использовали его преимущественно для генерации стандартных упражнений, что давало предсказуемо скромный дидактический эффект. Вывод авторов принципиален. Педагогическое мышление является более значимой переменной, чем технологический инструментарий.</w:t>
+        <w:t>Качественное исследование Zaimoğlu et al. [43] зафиксировало значительную вариативность в реальных практиках преподавателей. Педагоги с развитыми рефлексивными практиками применяли ИИ для создания дифференцированных заданий. Педагоги с меньшим опытом использовали его преимущественно для генерации стандартных упражнений, что давало предсказуемо скромный дидактический эффект. Вывод авторов принципиален. Педагогическое мышление является более значимой переменной, чем технологический инструментарий.</w:t>
       </w:r>
     </w:p>
     <w:p>
@@ -1142,7 +1156,7 @@
           <w:rFonts w:ascii="Times New Roman" w:hAnsi="Times New Roman" w:cs="Times New Roman"/>
           <w:sz w:val="24"/>
         </w:rPr>
-        <w:t>Wang et al. [40] обнаружили, что воспринимаемая поддержка преподавателя значимо связана с субъективным благополучием студентов даже в высокотехнологичных образовательных средах. Иными словами, человеческий педагогический компонент сохраняет свою незаменимость независимо от уровня технологизации обучения.</w:t>
+        <w:t>Pan et al. [40] обнаружили, что воспринимаемая поддержка преподавателя значимо связана с субъективным благополучием студентов даже в высокотехнологичных образовательных средах. Иными словами, человеческий педагогический компонент сохраняет свою незаменимость независимо от уровня технологизации обучения.</w:t>
       </w:r>
     </w:p>
     <w:p>
@@ -1282,7 +1296,7 @@
           <w:rFonts w:ascii="Times New Roman" w:hAnsi="Times New Roman" w:cs="Times New Roman"/>
           <w:sz w:val="24"/>
         </w:rPr>
-        <w:t>Российский педагогический вуз образует отличный контекст по четырём измерениям.</w:t>
+        <w:t>Российский педагогический вуз образует качественно иной контекст, понять который невозможно без рассмотрения нескольких взаимосвязанных факторов.</w:t>
       </w:r>
     </w:p>
     <w:p>
@@ -1296,49 +1310,7 @@
           <w:rFonts w:ascii="Times New Roman" w:hAnsi="Times New Roman" w:cs="Times New Roman"/>
           <w:sz w:val="24"/>
         </w:rPr>
-        <w:t>В нормативном плане ФГОС ВО по направлению «Педагогическое образование» закрепляет необходимость формирования цифровых компетенций, но прямых указаний на ИИ-инструменты не содержит. Между тем международный опыт показывает, что внедрение ИИ в высшую школу сопровождается как реальными дидактическими возможностями, так и серьёзными институциональными и педагогическими вызовами, требующими осмысленной политики на уровне университета [4]. Педагогическая легитимизация ИИ в российском вузе пока во многом определяется позицией конкретной кафедры.</w:t>
-      </w:r>
-    </w:p>
-    <w:p>
-      <w:pPr>
-        <w:spacing w:before="0" w:after="120"/>
-        <w:ind w:firstLine="709"/>
-        <w:jc w:val="both"/>
-      </w:pPr>
-      <w:r>
-        <w:rPr>
-          <w:rFonts w:ascii="Times New Roman" w:hAnsi="Times New Roman" w:cs="Times New Roman"/>
-          <w:sz w:val="24"/>
-        </w:rPr>
-        <w:t>В дидактическом плане отечественная методика преподавания иностранных языков опирается на развитую традицию коммуникативно-деятельностного подхода, в которой роль преподавателя как организатора живого иноязычного взаимодействия является центральной. Это создаёт ресурс в виде высокого уровня методической рефлексии преподавателей, но одновременно порождает потенциальный барьер в виде сопротивления технологической замене.</w:t>
-      </w:r>
-    </w:p>
-    <w:p>
-      <w:pPr>
-        <w:spacing w:before="0" w:after="120"/>
-        <w:ind w:firstLine="709"/>
-        <w:jc w:val="both"/>
-      </w:pPr>
-      <w:r>
-        <w:rPr>
-          <w:rFonts w:ascii="Times New Roman" w:hAnsi="Times New Roman" w:cs="Times New Roman"/>
-          <w:sz w:val="24"/>
-        </w:rPr>
-        <w:t>В языковом плане российские студенты педагогических вузов изучают английский как иностранный (EFL), что совпадает с преобладающим контекстом рассмотренных исследований и обеспечивает достаточно высокую переносимость результатов.</w:t>
-      </w:r>
-    </w:p>
-    <w:p>
-      <w:pPr>
-        <w:spacing w:before="0" w:after="120"/>
-        <w:ind w:firstLine="709"/>
-        <w:jc w:val="both"/>
-      </w:pPr>
-      <w:r>
-        <w:rPr>
-          <w:rFonts w:ascii="Times New Roman" w:hAnsi="Times New Roman" w:cs="Times New Roman"/>
-          <w:sz w:val="24"/>
-        </w:rPr>
-        <w:t>В технологическом плане доступность ряда зарубежных ИИ-инструментов в России имеет нормативные и технические ограничения. Это актуализирует вопрос об отечественных аналогах, педагогический потенциал которых пока остаётся неизученным.</w:t>
+        <w:t>ФГОС ВО по направлению «Педагогическое образование» закрепляет необходимость формирования цифровых компетенций, однако конкретных указаний на ИИ-инструменты не содержит, что порождает значительную неопределённость на уровне кафедр и учебных программ; педагогическая легитимизация ИИ пока во многом определяется позицией конкретной кафедры, тогда как международный опыт показывает необходимость осмысленной политики на уровне всего университета [4]. Дидактически отечественная методика преподавания иностранных языков опирается на развитую традицию коммуникативно-деятельностного подхода, в которой роль преподавателя как организатора живого иноязычного взаимодействия является центральной. Это, с одной стороны, задаёт высокий уровень методической рефлексии и тем самым создаёт ресурс для критического освоения ИИ, а с другой стороны, может формировать сопротивление тем моделям, где технологический компонент замещает непосредственный педагогический контакт. Языковой контекст оказывается наиболее благоприятным с точки зрения переносимости, поскольку российские студенты педагогических вузов изучают английский как иностранный (EFL), что принципиально совпадает с преобладающим контекстом рассмотренных исследований. Вместе с тем ограниченная доступность ряда зарубежных ИИ-инструментов актуализирует вопрос об отечественных аналогах, педагогический потенциал которых пока остаётся практически неизученным.</w:t>
       </w:r>
     </w:p>
     <w:p>
@@ -1478,7 +1450,7 @@
           <w:rFonts w:ascii="Times New Roman" w:hAnsi="Times New Roman" w:cs="Times New Roman"/>
           <w:sz w:val="24"/>
         </w:rPr>
-        <w:t>Синтез данных обзора позволяет обозначить условия, необходимые для успешной адаптации зарубежного опыта.</w:t>
+        <w:t>Синтез данных обзора позволяет обозначить условия, необходимые для успешной адаптации зарубежного опыта, и показательно, что все они оказываются не технологическими, а педагогическими по своей природе.</w:t>
       </w:r>
     </w:p>
     <w:p>
@@ -1492,7 +1464,7 @@
           <w:rFonts w:ascii="Times New Roman" w:hAnsi="Times New Roman" w:cs="Times New Roman"/>
           <w:sz w:val="24"/>
         </w:rPr>
-        <w:t>Методическое сопровождение значит больше, чем выбор инструмента. Исследование Sun et al. [43] убедительно показало, что педагогическое мышление преподавателя является более значимой переменной, чем технология как таковая. Стихийное внедрение без методической рамки, как правило, воспроизводит недостатки традиционного обучения в новой технологической оболочке.</w:t>
+        <w:t>Центральным из этих условий является качество методического сопровождения. Исследование Zaimoğlu et al. [43] убедительно показало, что педагогическое мышление преподавателя является более значимой переменной, чем выбор конкретного ИИ-инструмента, а это означает, что стихийное внедрение без методической рамки, как правило, воспроизводит ограничения традиционного обучения в новой технологической оболочке, а не преодолевает их.</w:t>
       </w:r>
     </w:p>
     <w:p>
@@ -1506,7 +1478,7 @@
           <w:rFonts w:ascii="Times New Roman" w:hAnsi="Times New Roman" w:cs="Times New Roman"/>
           <w:sz w:val="24"/>
         </w:rPr>
-        <w:t>Формирование у студентов рефлексивного отношения к ИИ-результатам представляет собой самостоятельную педагогическую задачу, не решающуюся сама собой. Li et al. [22] и Zhang et al. [17] независимо друг от друга зафиксировали устойчивую тенденцию к некритическому принятию ИИ-генерированного контента, и эту тенденцию нужно специально преодолевать.</w:t>
+        <w:t>Не менее существенным условием является целенаправленное формирование у студентов рефлексивного отношения к ИИ-контенту, которое не возникает само собой. Li et al. [22] и Zhang et al. [17] независимо друг от друга зафиксировали устойчивую тенденцию к некритическому принятию ИИ-генерированных результатов, и преодоление этой тенденции требует специальной педагогической работы, начиная с первых занятий.</w:t>
       </w:r>
     </w:p>
     <w:p>
@@ -1520,7 +1492,7 @@
           <w:rFonts w:ascii="Times New Roman" w:hAnsi="Times New Roman" w:cs="Times New Roman"/>
           <w:sz w:val="24"/>
         </w:rPr>
-        <w:t>Сохранение коммуникативного ядра обучения означает, что ИИ должен расширять возможности иноязычного взаимодействия, а не вытеснять его. Wang et al. [40] показали, что воспринимаемая поддержка преподавателя остаётся значимым фактором субъективного благополучия студентов даже в высокотехнологичных образовательных средах.</w:t>
+        <w:t>Оба названных условия предполагают более общий принцип, суть которого сводится к сохранению коммуникативного ядра обучения. Данные Pan et al. [40] показали, что воспринимаемая поддержка преподавателя остаётся значимым фактором субъективного благополучия студентов даже в высокотехнологичных образовательных средах, что указывает на неустранимость человеческого педагогического компонента независимо от уровня технологизации.</w:t>
       </w:r>
     </w:p>
     <w:p>
@@ -1534,21 +1506,7 @@
           <w:rFonts w:ascii="Times New Roman" w:hAnsi="Times New Roman" w:cs="Times New Roman"/>
           <w:sz w:val="24"/>
         </w:rPr>
-        <w:t>Институциональная поддержка создаёт необходимую, но недостаточную основу. Чёткая политика вуза в отношении ИИ, программы повышения квалификации преподавателей и соответствующая технологическая инфраструктура задают рамку; но без педагогической культуры рефлексии эта рамка рискует остаться невостребованной.</w:t>
-      </w:r>
-    </w:p>
-    <w:p>
-      <w:pPr>
-        <w:spacing w:before="0" w:after="120"/>
-        <w:ind w:firstLine="709"/>
-        <w:jc w:val="both"/>
-      </w:pPr>
-      <w:r>
-        <w:rPr>
-          <w:rFonts w:ascii="Times New Roman" w:hAnsi="Times New Roman" w:cs="Times New Roman"/>
-          <w:sz w:val="24"/>
-        </w:rPr>
-        <w:t>Нормативная пропедевтика академической честности применительно к ИИ представляет собой работу, которую необходимо вести с первого курса и которая требует не запретов, а диалога о границах и ответственности.</w:t>
+        <w:t>Наряду с педагогическими условиями необходима институциональная рамка, складывающаяся из чёткой политики вуза в отношении ИИ, программ повышения квалификации преподавателей и соответствующей технологической инфраструктуры. Вместе с тем институциональная поддержка является необходимым, но не достаточным условием, и без устойчивой педагогической культуры рефлексии она рискует остаться невостребованной. Отдельной задачей является нормативная пропедевтика академической честности применительно к ИИ, которую необходимо выстраивать с первого курса как диалог о границах и ответственности, а не как перечень запретов.</w:t>
       </w:r>
     </w:p>
     <w:p>
@@ -1618,7 +1576,7 @@
           <w:rFonts w:ascii="Times New Roman" w:hAnsi="Times New Roman" w:cs="Times New Roman"/>
           <w:sz w:val="24"/>
         </w:rPr>
-        <w:t>Систематический обзор 50 зарубежных источников 2020–2025 годов позволяет сформулировать несколько выводов, выходящих за рамки общего тезиса об «ИИ как полезном инструменте».</w:t>
+        <w:t>Систематический обзор 50 зарубежных источников 2020–2025 годов позволяет сформулировать выводы в соответствии с каждой из поставленных задач, и в совокупности эти выводы складываются в картину, выходящую за рамки общего тезиса об «ИИ как полезном инструменте».</w:t>
       </w:r>
     </w:p>
     <w:p>
@@ -1632,7 +1590,7 @@
           <w:rFonts w:ascii="Times New Roman" w:hAnsi="Times New Roman" w:cs="Times New Roman"/>
           <w:sz w:val="24"/>
         </w:rPr>
-        <w:t>Педагогическая эффективность ИИ в иноязычном образовании определяется не характеристиками самих инструментов, а качеством педагогического контекста, в который они встроены. Ни одно из рассмотренных исследований не подтверждает ни возможности, ни целесообразности замены преподавателя. Напротив, данные последовательно указывают на возрастание требований к педагогическому мастерству по мере того, как технологическая составляющая обучения усложняется.</w:t>
+        <w:t>Применительно к первой задаче, связанной с систематизацией направлений, установлено, что зарубежные исследования охватывают пять тематических блоков. Наибольший массив эмпирических данных накоплен по применению ИИ в письменной речи, тогда как устноречевая практика с ИИ-чатботами и особенно подготовка преподавателей к ИИ-насыщенной среде остаются относительно менее исследованными. Это распределение само по себе является педагогически значимым результатом обзора.</w:t>
       </w:r>
     </w:p>
     <w:p>
@@ -1646,7 +1604,7 @@
           <w:rFonts w:ascii="Times New Roman" w:hAnsi="Times New Roman" w:cs="Times New Roman"/>
           <w:sz w:val="24"/>
         </w:rPr>
-        <w:t>Российский педагогический вуз располагает собственным ресурсом для этой работы. Развитая традиция коммуникативно-деятельностной методики и высокий уровень методической рефлексии преподавательского сообщества создают прочную основу. Вопрос в том, будет ли этот ресурс задействован системно, а не стихийно.</w:t>
+        <w:t>Второй вывод, отвечающий на вопрос о педагогических эффектах и условиях, прослеживается во всех рассмотренных направлениях как сквозная закономерность. Педагогическая эффективность ИИ-инструментов определяется не их технологическими характеристиками, а качеством дидактического контекста, в который они встроены. Среди рассмотренных исследований нами не обнаружено ни одной работы, которая подтверждала бы возможность или целесообразность замены преподавателя; напротив, данные последовательно указывают на возрастание требований к педагогическому мастерству по мере усложнения технологической составляющей обучения.</w:t>
       </w:r>
     </w:p>
     <w:p>
@@ -1660,7 +1618,7 @@
           <w:rFonts w:ascii="Times New Roman" w:hAnsi="Times New Roman" w:cs="Times New Roman"/>
           <w:sz w:val="24"/>
         </w:rPr>
-        <w:t>Три направления, обозначенные как приоритетные, объединены общей логикой. Во всех трёх случаях ИИ выступает инструментом расширения возможностей иноязычного образования, а не их замещения.</w:t>
+        <w:t>Трансформация роли преподавателя, которой посвящена третья задача, разворачивается в направлении, которое можно охарактеризовать как профессиональное усложнение без упрощения. Преподаватель приобретает функции фасилитатора учебного опыта, критического посредника между студентом и ИИ-инструментом и проектировщика педагогических сред с генеративными технологиями, что требует более глубокой методической рефлексии, нежели традиционная модель передачи знания.</w:t>
       </w:r>
     </w:p>
     <w:p>
@@ -1674,7 +1632,21 @@
           <w:rFonts w:ascii="Times New Roman" w:hAnsi="Times New Roman" w:cs="Times New Roman"/>
           <w:sz w:val="24"/>
         </w:rPr>
-        <w:t>Перспективные направления дальнейших исследований связаны прежде всего с апробацией конкретных моделей интеграции ИИ в программы подготовки учителей английского языка в российских педагогических вузах, а также с педагогически ориентированным изучением возможностей отечественных ИИ-сервисов, представляющих собой ресурс, остающийся в значительной мере неисследованным.</w:t>
+        <w:t>Четвёртый вывод, соответствующий финальной задаче, связан с условиями и барьерами адаптации. Российский педагогический вуз располагает собственным ресурсом в виде развитой коммуникативно-деятельностной традиции и высокого уровня методической рефлексии. Три направления с наибольшим потенциалом адаптации, а именно ИИ-поддержка письменной речи, расширение внеаудиторной устноречевой практики и подготовка будущих учителей к работе в ИИ-насыщенной среде, объединены общей логикой, согласно которой ИИ выступает инструментом расширения образовательных возможностей, а не их замещения.</w:t>
+      </w:r>
+    </w:p>
+    <w:p>
+      <w:pPr>
+        <w:spacing w:before="0" w:after="120"/>
+        <w:ind w:firstLine="709"/>
+        <w:jc w:val="both"/>
+      </w:pPr>
+      <w:r>
+        <w:rPr>
+          <w:rFonts w:ascii="Times New Roman" w:hAnsi="Times New Roman" w:cs="Times New Roman"/>
+          <w:sz w:val="24"/>
+        </w:rPr>
+        <w:t>Ограничения настоящего обзора, прежде всего частичная воспроизводимость отбора, языковая избирательность корпуса и высокая скорость изменений в области генеративного ИИ, определяют направления дальнейших исследований. Приоритетными среди них представляются апробация конкретных моделей интеграции ИИ в программы подготовки учителей английского языка в российских педагогических вузах и педагогически ориентированное изучение возможностей отечественных ИИ-сервисов, потенциал которых пока фактически не исследован.</w:t>
       </w:r>
     </w:p>
     <w:p>
@@ -1786,7 +1758,7 @@
           <w:rFonts w:ascii="Times New Roman" w:hAnsi="Times New Roman" w:cs="Times New Roman"/>
           <w:sz w:val="24"/>
         </w:rPr>
-        <w:t>7. Godwin-Jones R. Emerging spaces for language learning: AI bots, ambient intelligence, and the metaverse // Language Learning and Technology. 2023. Vol. 27, No. 2. P. 6–27.</w:t>
+        <w:t>7. Godwin-Jones R. Emerging spaces for language learning: AI bots, ambient intelligence, and the metaverse // Language Learning and Technology. 2023. Vol. 27, No. 2. P. 6–27. URL: https://www.lltjournal.org/item/10125-73501/ (дата обращения: 22.06.2026).</w:t>
       </w:r>
     </w:p>
     <w:p>
@@ -1912,7 +1884,7 @@
           <w:rFonts w:ascii="Times New Roman" w:hAnsi="Times New Roman" w:cs="Times New Roman"/>
           <w:sz w:val="24"/>
         </w:rPr>
-        <w:t>16. Sallam M. et al. Higher education students' perceptions of ChatGPT: a global study of early reactions. 2025. URL: https://pmc.ncbi.nlm.nih.gov/articles/PMC11798494/ (дата обращения: 22.06.2026).</w:t>
+        <w:t>16. Sallam M. et al. Higher education students' perceptions of ChatGPT: a global study of early reactions // PLOS ONE. 2025. DOI: 10.1371/journal.pone.0315011 (дата обращения: 22.06.2026).</w:t>
       </w:r>
     </w:p>
     <w:p>
@@ -1926,7 +1898,7 @@
           <w:rFonts w:ascii="Times New Roman" w:hAnsi="Times New Roman" w:cs="Times New Roman"/>
           <w:sz w:val="24"/>
         </w:rPr>
-        <w:t>17. Zhang Y. et al. Perceptions vs. practices: academic integrity and actual ChatGPT use among EFL students. 2025. URL: https://pmc.ncbi.nlm.nih.gov/articles/PMC13044046/ (дата обращения: 22.06.2026).</w:t>
+        <w:t>17. Zhang Y. et al. Perceptions vs. practices: academic integrity and actual ChatGPT use among EFL students // Frontiers in Psychology. 2025. URL: https://pmc.ncbi.nlm.nih.gov/articles/PMC13044046/ (дата обращения: 22.06.2026).</w:t>
       </w:r>
     </w:p>
     <w:p>
@@ -2178,7 +2150,7 @@
           <w:rFonts w:ascii="Times New Roman" w:hAnsi="Times New Roman" w:cs="Times New Roman"/>
           <w:sz w:val="24"/>
         </w:rPr>
-        <w:t>35. Lin C. et al. AI-empowered applications effects on EFL learners' engagement and academic procrastination. 2024. URL: https://pmc.ncbi.nlm.nih.gov/articles/PMC11656581/ (дата обращения: 22.06.2026).</w:t>
+        <w:t>35. Lin C. et al. AI-empowered applications effects on EFL learners' engagement in the classroom and academic procrastination // BMC Psychology. 2024. Vol. 12. Art. 739. URL: https://pmc.ncbi.nlm.nih.gov/articles/PMC11656581/ (дата обращения: 22.06.2026).</w:t>
       </w:r>
     </w:p>
     <w:p>
@@ -2192,7 +2164,7 @@
           <w:rFonts w:ascii="Times New Roman" w:hAnsi="Times New Roman" w:cs="Times New Roman"/>
           <w:sz w:val="24"/>
         </w:rPr>
-        <w:t>36. Wei X. et al. From literacy to learning: sequential mediation of attitudes and enjoyment in AI-assisted EFL education. 2024. URL: https://pmc.ncbi.nlm.nih.gov/articles/PMC11402731/ (дата обращения: 22.06.2026).</w:t>
+        <w:t>36. Fan J. et al. From literacy to learning: sequential mediation of attitudes and enjoyment in AI-assisted EFL education // Heliyon. 2024. DOI: 10.1016/j.heliyon.2024.e37158 (дата обращения: 22.06.2026).</w:t>
       </w:r>
     </w:p>
     <w:p>
@@ -2206,7 +2178,7 @@
           <w:rFonts w:ascii="Times New Roman" w:hAnsi="Times New Roman" w:cs="Times New Roman"/>
           <w:sz w:val="24"/>
         </w:rPr>
-        <w:t>37. Chen S. et al. Beyond tool use: how ecological coupling configures AI's empowerment for language learning. 2025. URL: https://pmc.ncbi.nlm.nih.gov/articles/PMC12872916/ (дата обращения: 22.06.2026).</w:t>
+        <w:t>37. Ge L. et al. Beyond tool use: how ecological coupling configures AI's empowerment for language learning engagement // Frontiers in Psychology. 2026. DOI: 10.3389/fpsyg.2026.1747355 (дата обращения: 22.06.2026).</w:t>
       </w:r>
     </w:p>
     <w:p>
@@ -2220,7 +2192,7 @@
           <w:rFonts w:ascii="Times New Roman" w:hAnsi="Times New Roman" w:cs="Times New Roman"/>
           <w:sz w:val="24"/>
         </w:rPr>
-        <w:t>38. Liu J. et al. The human touch in AI: self-determination theory and teacher scaffolding. 2025. URL: https://pmc.ncbi.nlm.nih.gov/articles/PMC12268064/ (дата обращения: 22.06.2026).</w:t>
+        <w:t>38. Ma Y. et al. The human touch in AI: optimizing language learning through self-determination theory and teacher scaffolding // Frontiers in Psychology. 2025. DOI: 10.3389/fpsyg.2025.1568239 (дата обращения: 22.06.2026).</w:t>
       </w:r>
     </w:p>
     <w:p>
@@ -2248,7 +2220,7 @@
           <w:rFonts w:ascii="Times New Roman" w:hAnsi="Times New Roman" w:cs="Times New Roman"/>
           <w:sz w:val="24"/>
         </w:rPr>
-        <w:t>40. Wang Y. et al. Effects of perceived teacher support on learner well-being in AI-integrated environment. 2025. URL: https://pmc.ncbi.nlm.nih.gov/articles/PMC12481513/ (дата обращения: 22.06.2026).</w:t>
+        <w:t>40. Pan Y. et al. Effects of perceived teacher support and growth language mindset on learner well-being in AI-integrated environment // Frontiers in Psychology. 2025. DOI: 10.3389/fpsyg.2025.1660462 (дата обращения: 22.06.2026).</w:t>
       </w:r>
     </w:p>
     <w:p>
@@ -2262,7 +2234,7 @@
           <w:rFonts w:ascii="Times New Roman" w:hAnsi="Times New Roman" w:cs="Times New Roman"/>
           <w:sz w:val="24"/>
         </w:rPr>
-        <w:t>41. Chen H. et al. Empowering EFL teachers' perceptions of generative AI-mediated self-professionalism. 2025. URL: https://pmc.ncbi.nlm.nih.gov/articles/PMC12185028/ (дата обращения: 22.06.2026).</w:t>
+        <w:t>41. Chen H. et al. Empowering EFL teachers' perceptions of generative AI-mediated self-professionalism // PLOS ONE. 2025. DOI: 10.1371/journal.pone.0326735 (дата обращения: 22.06.2026).</w:t>
       </w:r>
     </w:p>
     <w:p>
@@ -2276,7 +2248,7 @@
           <w:rFonts w:ascii="Times New Roman" w:hAnsi="Times New Roman" w:cs="Times New Roman"/>
           <w:sz w:val="24"/>
         </w:rPr>
-        <w:t>42. Zhao L. et al. AI powered ELT: instructors' transformative roles and opportunities. 2025. URL: https://pmc.ncbi.nlm.nih.gov/articles/PMC12121750/ (дата обращения: 22.06.2026).</w:t>
+        <w:t>42. Almegren A. et al. AI powered ELT: instructors' transformative roles and opportunities // PLOS ONE. 2025. DOI: 10.1371/journal.pone.0324910 (дата обращения: 22.06.2026).</w:t>
       </w:r>
     </w:p>
     <w:p>
@@ -2290,7 +2262,7 @@
           <w:rFonts w:ascii="Times New Roman" w:hAnsi="Times New Roman" w:cs="Times New Roman"/>
           <w:sz w:val="24"/>
         </w:rPr>
-        <w:t>43. Sun Z. et al. Teacher cognition and practices in using generative AI in EFL higher education. 2025. URL: https://pmc.ncbi.nlm.nih.gov/articles/PMC12466831/ (дата обращения: 22.06.2026).</w:t>
+        <w:t>43. Zaimoğlu S. et al. Teacher cognition and practices in using generative AI tools to support student engagement in EFL higher-education contexts // Behavioural Sciences. 2025. DOI: 10.3390/bs15091202 (дата обращения: 22.06.2026).</w:t>
       </w:r>
     </w:p>
     <w:p>
@@ -2318,7 +2290,7 @@
           <w:rFonts w:ascii="Times New Roman" w:hAnsi="Times New Roman" w:cs="Times New Roman"/>
           <w:sz w:val="24"/>
         </w:rPr>
-        <w:t>45. Li X. et al. The efficacy of AI-powered scaffolding in EFL acquisition in tertiary education. 2025. URL: https://pmc.ncbi.nlm.nih.gov/articles/PMC12836060/ (дата обращения: 22.06.2026).</w:t>
+        <w:t>45. Li X. et al. The efficacy of AI-powered scaffolding in individual EFL acquisition efficiency in tertiary educational context // Frontiers in Psychology. 2025. DOI: 10.3389/fpsyg.2025.1613285 (дата обращения: 22.06.2026).</w:t>
       </w:r>
     </w:p>
     <w:p>

</xml_diff>